<commit_message>
FinOps: KPI «Ahorro estimado» con escenario de negocio, introducción en una página y guion corto de la demo
- FinOps pasa a 5 KPI: ahorro neto del periodo a partir de los mensajes procesados, la autonomía efectiva y el
  coste de la IA. Su ficha permite elegir escenario (6, 8 o 12 min por mensaje), editar el salario bruto, los
  minutos y el tiempo ahorrado en los escalados, y muestra el cálculo paso a paso, el coste de un tramitador,
  el coste evitado por día y los tres escenarios
- ahorro.js: cálculo puro compartido por el panel y Node; hipótesis por defecto en kpis.negocio del dataset
- tests/ahorro.test.js en make test
- intro.html reúne la introducción en cuatro secciones; intro-fnol.html e intro-sistema.html redirigen a ella
- Guion corto de la demo en markdown y Word, recorrido regenerado y documentación al día

Co-Authored-By: Claude Opus 5.5 <noreply@anthropic.com>
</commit_message>
<xml_diff>
--- a/_docs/guion-demo.docx
+++ b/_docs/guion-demo.docx
@@ -15,7 +15,7 @@
         <w:spacing w:after="120"/>
       </w:pPr>
       <w:r>
-        <w:t xml:space="preserve">Guion paso a paso para una sesión de 30-35 minutos: introducción con las páginas </w:t>
+        <w:t xml:space="preserve">Guion paso a paso para una sesión de 30-35 minutos: introducción en las cuatro secciones de </w:t>
       </w:r>
       <w:r>
         <w:rPr>
@@ -24,19 +24,7 @@
           <w:sz w:val="20"/>
           <w:szCs w:val="20"/>
         </w:rPr>
-        <w:t xml:space="preserve">intro-fnol.html</w:t>
-      </w:r>
-      <w:r>
-        <w:t xml:space="preserve"> e </w:t>
-      </w:r>
-      <w:r>
-        <w:rPr>
-          <w:rFonts w:ascii="Consolas" w:cs="Consolas" w:eastAsia="Consolas" w:hAnsi="Consolas"/>
-          <w:color w:val="1B2A4A"/>
-          <w:sz w:val="20"/>
-          <w:szCs w:val="20"/>
-        </w:rPr>
-        <w:t xml:space="preserve">intro-sistema.html</w:t>
+        <w:t xml:space="preserve">intro.html</w:t>
       </w:r>
       <w:r>
         <w:t xml:space="preserve"> y demo sobre el Paquete A (13 mensajes) en </w:t>
@@ -275,7 +263,7 @@
           </w:pPr>
           <w:hyperlink w:history="1" w:anchor="_Toc2">
             <w:r>
-              <w:t xml:space="preserve">1. FNOL: de qué hablamos (≈1 min)</w:t>
+              <w:t xml:space="preserve">1. El problema: FNOL, un proceso crítico, y el gobierno de la IA (≈1 min)</w:t>
             </w:r>
             <w:r>
               <w:tab/>
@@ -297,7 +285,7 @@
           </w:pPr>
           <w:hyperlink w:history="1" w:anchor="_Toc3">
             <w:r>
-              <w:t xml:space="preserve">2. El sistema que vais a ver (≈4 min)</w:t>
+              <w:t xml:space="preserve">2. La solución: una plataforma multicanal integrada, orquestada por 4 agentes y con un buen gobierno de la IA (≈2 min)</w:t>
             </w:r>
             <w:r>
               <w:tab/>
@@ -385,7 +373,7 @@
           </w:pPr>
           <w:hyperlink w:history="1" w:anchor="_Toc7">
             <w:r>
-              <w:t xml:space="preserve">2.4 Dos usuarios, dos pantallas</w:t>
+              <w:t xml:space="preserve">2.4 La trazabilidad, base del gobierno</w:t>
             </w:r>
             <w:r>
               <w:tab/>
@@ -400,14 +388,14 @@
         </w:p>
         <w:p>
           <w:pPr>
-            <w:pStyle w:val="TOC2"/>
+            <w:pStyle w:val="TOC1"/>
             <w:tabs>
               <w:tab w:val="right" w:pos="9638" w:leader="dot"/>
             </w:tabs>
           </w:pPr>
           <w:hyperlink w:history="1" w:anchor="_Toc8">
             <w:r>
-              <w:t xml:space="preserve">2.5 Por qué el gobierno decide el éxito</w:t>
+              <w:t xml:space="preserve">3. Los actores: el tramitador y los equipos de IT, Finanzas, Compliance, etc. (≈1 min)</w:t>
             </w:r>
             <w:r>
               <w:tab/>
@@ -429,7 +417,7 @@
           </w:pPr>
           <w:hyperlink w:history="1" w:anchor="_Toc9">
             <w:r>
-              <w:t xml:space="preserve">3. Parte 1 · Triaje</w:t>
+              <w:t xml:space="preserve">4. La demo: un viaje desde que llega un mensaje hasta el panel de gobierno (≈1 min)</w:t>
             </w:r>
             <w:r>
               <w:tab/>
@@ -444,14 +432,14 @@
         </w:p>
         <w:p>
           <w:pPr>
-            <w:pStyle w:val="TOC2"/>
+            <w:pStyle w:val="TOC1"/>
             <w:tabs>
               <w:tab w:val="right" w:pos="9638" w:leader="dot"/>
             </w:tabs>
           </w:pPr>
           <w:hyperlink w:history="1" w:anchor="_Toc10">
             <w:r>
-              <w:t xml:space="preserve">Paso 1 · Las seis fases y los cinco canales (min 5-6:30)</w:t>
+              <w:t xml:space="preserve">5. Parte 1 · Triaje</w:t>
             </w:r>
             <w:r>
               <w:tab/>
@@ -473,7 +461,7 @@
           </w:pPr>
           <w:hyperlink w:history="1" w:anchor="_Toc11">
             <w:r>
-              <w:t xml:space="preserve">Paso 2 · Procesar el Paquete A (min 6:30-8:30)</w:t>
+              <w:t xml:space="preserve">Paso 1 · Las seis fases y los cinco canales (min 5-6:30)</w:t>
             </w:r>
             <w:r>
               <w:tab/>
@@ -495,7 +483,7 @@
           </w:pPr>
           <w:hyperlink w:history="1" w:anchor="_Toc12">
             <w:r>
-              <w:t xml:space="preserve">Paso 3 · La ficha de un aprobado: MSG-A-01 (min 8:30-10)</w:t>
+              <w:t xml:space="preserve">Paso 2 · Procesar el Paquete A (min 6:30-8:30)</w:t>
             </w:r>
             <w:r>
               <w:tab/>
@@ -517,7 +505,7 @@
           </w:pPr>
           <w:hyperlink w:history="1" w:anchor="_Toc13">
             <w:r>
-              <w:t xml:space="preserve">Paso 4 · La ficha de un «A revisar»: MSG-A-08 (min 10-12)</w:t>
+              <w:t xml:space="preserve">Paso 3 · La ficha de un aprobado: MSG-A-01 (min 8:30-10)</w:t>
             </w:r>
             <w:r>
               <w:tab/>
@@ -539,7 +527,7 @@
           </w:pPr>
           <w:hyperlink w:history="1" w:anchor="_Toc14">
             <w:r>
-              <w:t xml:space="preserve">Paso 5 · La respuesta cruda de MSG-A-12 (min 12-14)</w:t>
+              <w:t xml:space="preserve">Paso 4 · La ficha de un «A revisar»: MSG-A-08 (min 10-12)</w:t>
             </w:r>
             <w:r>
               <w:tab/>
@@ -547,6 +535,28 @@
             <w:r>
               <w:fldChar w:fldCharType="begin" w:dirty="true"/>
               <w:instrText xml:space="preserve">PAGEREF _Toc14 \h</w:instrText>
+              <w:fldChar w:fldCharType="separate"/>
+              <w:fldChar w:fldCharType="end"/>
+            </w:r>
+          </w:hyperlink>
+        </w:p>
+        <w:p>
+          <w:pPr>
+            <w:pStyle w:val="TOC2"/>
+            <w:tabs>
+              <w:tab w:val="right" w:pos="9638" w:leader="dot"/>
+            </w:tabs>
+          </w:pPr>
+          <w:hyperlink w:history="1" w:anchor="_Toc15">
+            <w:r>
+              <w:t xml:space="preserve">Paso 5 · La respuesta cruda de MSG-A-12 (min 12-14)</w:t>
+            </w:r>
+            <w:r>
+              <w:tab/>
+            </w:r>
+            <w:r>
+              <w:fldChar w:fldCharType="begin" w:dirty="true"/>
+              <w:instrText xml:space="preserve">PAGEREF _Toc15 \h</w:instrText>
               <w:fldChar w:fldCharType="separate"/>
               <w:fldChar w:fldCharType="end"/>
             </w:r>
@@ -559,31 +569,9 @@
               <w:tab w:val="right" w:pos="9638" w:leader="dot"/>
             </w:tabs>
           </w:pPr>
-          <w:hyperlink w:history="1" w:anchor="_Toc15">
-            <w:r>
-              <w:t xml:space="preserve">4. Parte 2 · Gobierno</w:t>
-            </w:r>
-            <w:r>
-              <w:tab/>
-            </w:r>
-            <w:r>
-              <w:fldChar w:fldCharType="begin" w:dirty="true"/>
-              <w:instrText xml:space="preserve">PAGEREF _Toc15 \h</w:instrText>
-              <w:fldChar w:fldCharType="separate"/>
-              <w:fldChar w:fldCharType="end"/>
-            </w:r>
-          </w:hyperlink>
-        </w:p>
-        <w:p>
-          <w:pPr>
-            <w:pStyle w:val="TOC2"/>
-            <w:tabs>
-              <w:tab w:val="right" w:pos="9638" w:leader="dot"/>
-            </w:tabs>
-          </w:pPr>
           <w:hyperlink w:history="1" w:anchor="_Toc16">
             <w:r>
-              <w:t xml:space="preserve">4.0 Entrada al panel (min 14-15)</w:t>
+              <w:t xml:space="preserve">6. Parte 2 · Gobierno</w:t>
             </w:r>
             <w:r>
               <w:tab/>
@@ -605,7 +593,7 @@
           </w:pPr>
           <w:hyperlink w:history="1" w:anchor="_Toc17">
             <w:r>
-              <w:t xml:space="preserve">Paso 6 · Resumen (min 15-17)</w:t>
+              <w:t xml:space="preserve">6.0 Entrada al panel (min 14-15)</w:t>
             </w:r>
             <w:r>
               <w:tab/>
@@ -627,7 +615,7 @@
           </w:pPr>
           <w:hyperlink w:history="1" w:anchor="_Toc18">
             <w:r>
-              <w:t xml:space="preserve">Paso 7 · Agentes: el agente de Reglas (min 17-18:30)</w:t>
+              <w:t xml:space="preserve">Paso 6 · Resumen (min 15-17)</w:t>
             </w:r>
             <w:r>
               <w:tab/>
@@ -649,7 +637,7 @@
           </w:pPr>
           <w:hyperlink w:history="1" w:anchor="_Toc19">
             <w:r>
-              <w:t xml:space="preserve">Paso 8 · Trazabilidad (min 18:30-19:30)</w:t>
+              <w:t xml:space="preserve">Paso 7 · Agentes: el agente de Reglas (min 17-18:30)</w:t>
             </w:r>
             <w:r>
               <w:tab/>
@@ -671,7 +659,7 @@
           </w:pPr>
           <w:hyperlink w:history="1" w:anchor="_Toc20">
             <w:r>
-              <w:t xml:space="preserve">Paso 9 · Autonomía (min 19:30-20:30)</w:t>
+              <w:t xml:space="preserve">Paso 8 · Trazabilidad (min 18:30-19:30)</w:t>
             </w:r>
             <w:r>
               <w:tab/>
@@ -693,7 +681,7 @@
           </w:pPr>
           <w:hyperlink w:history="1" w:anchor="_Toc21">
             <w:r>
-              <w:t xml:space="preserve">Paso 10 · Guardrails (min 20:30-22)</w:t>
+              <w:t xml:space="preserve">Paso 9 · Autonomía (min 19:30-20:30)</w:t>
             </w:r>
             <w:r>
               <w:tab/>
@@ -715,7 +703,7 @@
           </w:pPr>
           <w:hyperlink w:history="1" w:anchor="_Toc22">
             <w:r>
-              <w:t xml:space="preserve">Paso 11 · Intervención humana: MSG-A-04 (min 22-24)</w:t>
+              <w:t xml:space="preserve">Paso 10 · Guardrails (min 20:30-22)</w:t>
             </w:r>
             <w:r>
               <w:tab/>
@@ -737,7 +725,7 @@
           </w:pPr>
           <w:hyperlink w:history="1" w:anchor="_Toc23">
             <w:r>
-              <w:t xml:space="preserve">Paso 12 · Fraude: MSG-A-13, MSG-A-09 y MSG-A-02 (min 24-26)</w:t>
+              <w:t xml:space="preserve">Paso 11 · Intervención humana: MSG-A-04 (min 22-24)</w:t>
             </w:r>
             <w:r>
               <w:tab/>
@@ -759,7 +747,7 @@
           </w:pPr>
           <w:hyperlink w:history="1" w:anchor="_Toc24">
             <w:r>
-              <w:t xml:space="preserve">Paso 13 · Razonamiento y replay (min 26-27:30)</w:t>
+              <w:t xml:space="preserve">Paso 12 · Fraude: MSG-A-13, MSG-A-09 y MSG-A-02 (min 24-26)</w:t>
             </w:r>
             <w:r>
               <w:tab/>
@@ -781,7 +769,7 @@
           </w:pPr>
           <w:hyperlink w:history="1" w:anchor="_Toc25">
             <w:r>
-              <w:t xml:space="preserve">Paso 14 · Knowledge Bases (min 27:30-29)</w:t>
+              <w:t xml:space="preserve">Paso 13 · Razonamiento y replay (min 26-27:30)</w:t>
             </w:r>
             <w:r>
               <w:tab/>
@@ -803,7 +791,7 @@
           </w:pPr>
           <w:hyperlink w:history="1" w:anchor="_Toc26">
             <w:r>
-              <w:t xml:space="preserve">Paso 15 · Cumplimiento: el termómetro (min 29-30:30)</w:t>
+              <w:t xml:space="preserve">Paso 14 · Knowledge Bases (min 27:30-29)</w:t>
             </w:r>
             <w:r>
               <w:tab/>
@@ -825,7 +813,7 @@
           </w:pPr>
           <w:hyperlink w:history="1" w:anchor="_Toc27">
             <w:r>
-              <w:t xml:space="preserve">Paso 16 · FinOps (min 30:30-32)</w:t>
+              <w:t xml:space="preserve">Paso 15 · Cumplimiento: el termómetro (min 29-30:30)</w:t>
             </w:r>
             <w:r>
               <w:tab/>
@@ -847,7 +835,7 @@
           </w:pPr>
           <w:hyperlink w:history="1" w:anchor="_Toc28">
             <w:r>
-              <w:t xml:space="preserve">Paso 17 · Medidas correctivas (min 32-33:30)</w:t>
+              <w:t xml:space="preserve">Paso 16 · FinOps (min 30:30-32)</w:t>
             </w:r>
             <w:r>
               <w:tab/>
@@ -869,7 +857,7 @@
           </w:pPr>
           <w:hyperlink w:history="1" w:anchor="_Toc29">
             <w:r>
-              <w:t xml:space="preserve">Paso 18 · Histórico (min 33:30-34)</w:t>
+              <w:t xml:space="preserve">Paso 17 · Medidas correctivas (min 32-33:30)</w:t>
             </w:r>
             <w:r>
               <w:tab/>
@@ -884,14 +872,14 @@
         </w:p>
         <w:p>
           <w:pPr>
-            <w:pStyle w:val="TOC1"/>
+            <w:pStyle w:val="TOC2"/>
             <w:tabs>
               <w:tab w:val="right" w:pos="9638" w:leader="dot"/>
             </w:tabs>
           </w:pPr>
           <w:hyperlink w:history="1" w:anchor="_Toc30">
             <w:r>
-              <w:t xml:space="preserve">5. Cierre (min 34-35)</w:t>
+              <w:t xml:space="preserve">Paso 18 · Histórico (min 33:30-34)</w:t>
             </w:r>
             <w:r>
               <w:tab/>
@@ -913,7 +901,7 @@
           </w:pPr>
           <w:hyperlink w:history="1" w:anchor="_Toc31">
             <w:r>
-              <w:t xml:space="preserve">Anexo A · Los 13 mensajes del Paquete A</w:t>
+              <w:t xml:space="preserve">7. Cierre (min 34-35)</w:t>
             </w:r>
             <w:r>
               <w:tab/>
@@ -935,7 +923,7 @@
           </w:pPr>
           <w:hyperlink w:history="1" w:anchor="_Toc32">
             <w:r>
-              <w:t xml:space="preserve">Anexo B · Chuleta de cifras</w:t>
+              <w:t xml:space="preserve">Anexo A · Los 13 mensajes del Paquete A</w:t>
             </w:r>
             <w:r>
               <w:tab/>
@@ -957,7 +945,7 @@
           </w:pPr>
           <w:hyperlink w:history="1" w:anchor="_Toc33">
             <w:r>
-              <w:t xml:space="preserve">Anexo C · Matices para no pisar charcos</w:t>
+              <w:t xml:space="preserve">Anexo B · Chuleta de cifras</w:t>
             </w:r>
             <w:r>
               <w:tab/>
@@ -979,7 +967,7 @@
           </w:pPr>
           <w:hyperlink w:history="1" w:anchor="_Toc34">
             <w:r>
-              <w:t xml:space="preserve">Anexo D · Versión de 20 minutos</w:t>
+              <w:t xml:space="preserve">Anexo C · Matices para no pisar charcos</w:t>
             </w:r>
             <w:r>
               <w:tab/>
@@ -987,6 +975,28 @@
             <w:r>
               <w:fldChar w:fldCharType="begin" w:dirty="true"/>
               <w:instrText xml:space="preserve">PAGEREF _Toc34 \h</w:instrText>
+              <w:fldChar w:fldCharType="separate"/>
+              <w:fldChar w:fldCharType="end"/>
+            </w:r>
+          </w:hyperlink>
+        </w:p>
+        <w:p>
+          <w:pPr>
+            <w:pStyle w:val="TOC1"/>
+            <w:tabs>
+              <w:tab w:val="right" w:pos="9638" w:leader="dot"/>
+            </w:tabs>
+          </w:pPr>
+          <w:hyperlink w:history="1" w:anchor="_Toc35">
+            <w:r>
+              <w:t xml:space="preserve">Anexo D · Versión de 20 minutos</w:t>
+            </w:r>
+            <w:r>
+              <w:tab/>
+            </w:r>
+            <w:r>
+              <w:fldChar w:fldCharType="begin" w:dirty="true"/>
+              <w:instrText xml:space="preserve">PAGEREF _Toc35 \h</w:instrText>
               <w:fldChar w:fldCharType="separate"/>
               <w:fldChar w:fldCharType="end"/>
             </w:r>
@@ -1057,7 +1067,7 @@
           <w:sz w:val="20"/>
           <w:szCs w:val="20"/>
         </w:rPr>
-        <w:t xml:space="preserve">intro-fnol.html</w:t>
+        <w:t xml:space="preserve">intro.html</w:t>
       </w:r>
       <w:r>
         <w:t xml:space="preserve">.</w:t>
@@ -1358,7 +1368,7 @@
                 <w:sz w:val="19"/>
                 <w:szCs w:val="19"/>
               </w:rPr>
-              <w:t xml:space="preserve">1. FNOL: de qué hablamos</w:t>
+              <w:t xml:space="preserve">1. El problema</w:t>
             </w:r>
           </w:p>
         </w:tc>
@@ -1386,7 +1396,14 @@
                 <w:sz w:val="19"/>
                 <w:szCs w:val="19"/>
               </w:rPr>
-              <w:t xml:space="preserve">intro-fnol.html</w:t>
+              <w:t xml:space="preserve">intro.html</w:t>
+            </w:r>
+            <w:r>
+              <w:rPr>
+                <w:sz w:val="19"/>
+                <w:szCs w:val="19"/>
+              </w:rPr>
+              <w:t xml:space="preserve"> · El problema</w:t>
             </w:r>
           </w:p>
         </w:tc>
@@ -1414,7 +1431,7 @@
                 <w:sz w:val="19"/>
                 <w:szCs w:val="19"/>
               </w:rPr>
-              <w:t xml:space="preserve">1-5</w:t>
+              <w:t xml:space="preserve">1-3</w:t>
             </w:r>
           </w:p>
         </w:tc>
@@ -1440,7 +1457,7 @@
                 <w:sz w:val="19"/>
                 <w:szCs w:val="19"/>
               </w:rPr>
-              <w:t xml:space="preserve">2. El sistema que vais a ver</w:t>
+              <w:t xml:space="preserve">2. La solución</w:t>
             </w:r>
           </w:p>
         </w:tc>
@@ -1468,7 +1485,14 @@
                 <w:sz w:val="19"/>
                 <w:szCs w:val="19"/>
               </w:rPr>
-              <w:t xml:space="preserve">intro-sistema.html</w:t>
+              <w:t xml:space="preserve">intro.html</w:t>
+            </w:r>
+            <w:r>
+              <w:rPr>
+                <w:sz w:val="19"/>
+                <w:szCs w:val="19"/>
+              </w:rPr>
+              <w:t xml:space="preserve"> · La solución</w:t>
             </w:r>
           </w:p>
         </w:tc>
@@ -1496,7 +1520,7 @@
                 <w:sz w:val="19"/>
                 <w:szCs w:val="19"/>
               </w:rPr>
-              <w:t xml:space="preserve">5-14</w:t>
+              <w:t xml:space="preserve">3-4</w:t>
             </w:r>
           </w:p>
         </w:tc>
@@ -1522,7 +1546,7 @@
                 <w:sz w:val="19"/>
                 <w:szCs w:val="19"/>
               </w:rPr>
-              <w:t xml:space="preserve">3. Parte 1 · Triaje (pasos 1-5)</w:t>
+              <w:t xml:space="preserve">3. Los actores</w:t>
             </w:r>
           </w:p>
         </w:tc>
@@ -1550,7 +1574,14 @@
                 <w:sz w:val="19"/>
                 <w:szCs w:val="19"/>
               </w:rPr>
-              <w:t xml:space="preserve">index.html</w:t>
+              <w:t xml:space="preserve">intro.html</w:t>
+            </w:r>
+            <w:r>
+              <w:rPr>
+                <w:sz w:val="19"/>
+                <w:szCs w:val="19"/>
+              </w:rPr>
+              <w:t xml:space="preserve"> · Los actores</w:t>
             </w:r>
           </w:p>
         </w:tc>
@@ -1578,7 +1609,7 @@
                 <w:sz w:val="19"/>
                 <w:szCs w:val="19"/>
               </w:rPr>
-              <w:t xml:space="preserve">14-15</w:t>
+              <w:t xml:space="preserve">4-5</w:t>
             </w:r>
           </w:p>
         </w:tc>
@@ -1604,7 +1635,7 @@
                 <w:sz w:val="19"/>
                 <w:szCs w:val="19"/>
               </w:rPr>
-              <w:t xml:space="preserve">4.0 Entrada al panel de gobierno</w:t>
+              <w:t xml:space="preserve">4. La demo</w:t>
             </w:r>
           </w:p>
         </w:tc>
@@ -1632,14 +1663,14 @@
                 <w:sz w:val="19"/>
                 <w:szCs w:val="19"/>
               </w:rPr>
-              <w:t xml:space="preserve">gobierno.html</w:t>
-            </w:r>
-            <w:r>
-              <w:rPr>
-                <w:sz w:val="19"/>
-                <w:szCs w:val="19"/>
-              </w:rPr>
-              <w:t xml:space="preserve"> · Inicio</w:t>
+              <w:t xml:space="preserve">intro.html</w:t>
+            </w:r>
+            <w:r>
+              <w:rPr>
+                <w:sz w:val="19"/>
+                <w:szCs w:val="19"/>
+              </w:rPr>
+              <w:t xml:space="preserve"> · La demo</w:t>
             </w:r>
           </w:p>
         </w:tc>
@@ -1667,7 +1698,7 @@
                 <w:sz w:val="19"/>
                 <w:szCs w:val="19"/>
               </w:rPr>
-              <w:t xml:space="preserve">15-34</w:t>
+              <w:t xml:space="preserve">5-14</w:t>
             </w:r>
           </w:p>
         </w:tc>
@@ -1693,7 +1724,7 @@
                 <w:sz w:val="19"/>
                 <w:szCs w:val="19"/>
               </w:rPr>
-              <w:t xml:space="preserve">4. Parte 2 · Gobierno (pasos 6-18)</w:t>
+              <w:t xml:space="preserve">5. Parte 1 · Triaje (pasos 1-5)</w:t>
             </w:r>
           </w:p>
         </w:tc>
@@ -1721,7 +1752,7 @@
                 <w:sz w:val="19"/>
                 <w:szCs w:val="19"/>
               </w:rPr>
-              <w:t xml:space="preserve">gobierno.html</w:t>
+              <w:t xml:space="preserve">index.html</w:t>
             </w:r>
           </w:p>
         </w:tc>
@@ -1749,6 +1780,177 @@
                 <w:sz w:val="19"/>
                 <w:szCs w:val="19"/>
               </w:rPr>
+              <w:t xml:space="preserve">14-15</w:t>
+            </w:r>
+          </w:p>
+        </w:tc>
+        <w:tc>
+          <w:tcPr>
+            <w:tcW w:type="dxa" w:w="4007"/>
+            <w:tcBorders>
+              <w:top w:val="single" w:color="C9CED8" w:sz="4"/>
+              <w:left w:val="single" w:color="C9CED8" w:sz="4"/>
+              <w:bottom w:val="single" w:color="C9CED8" w:sz="4"/>
+              <w:right w:val="single" w:color="C9CED8" w:sz="4"/>
+            </w:tcBorders>
+            <w:tcMar>
+              <w:top w:type="dxa" w:w="60"/>
+              <w:left w:type="dxa" w:w="100"/>
+              <w:bottom w:type="dxa" w:w="60"/>
+              <w:right w:type="dxa" w:w="100"/>
+            </w:tcMar>
+          </w:tcPr>
+          <w:p>
+            <w:r>
+              <w:rPr>
+                <w:sz w:val="19"/>
+                <w:szCs w:val="19"/>
+              </w:rPr>
+              <w:t xml:space="preserve">6.0 Entrada al panel de gobierno</w:t>
+            </w:r>
+          </w:p>
+        </w:tc>
+        <w:tc>
+          <w:tcPr>
+            <w:tcW w:type="dxa" w:w="3570"/>
+            <w:tcBorders>
+              <w:top w:val="single" w:color="C9CED8" w:sz="4"/>
+              <w:left w:val="single" w:color="C9CED8" w:sz="4"/>
+              <w:bottom w:val="single" w:color="C9CED8" w:sz="4"/>
+              <w:right w:val="single" w:color="C9CED8" w:sz="4"/>
+            </w:tcBorders>
+            <w:tcMar>
+              <w:top w:type="dxa" w:w="60"/>
+              <w:left w:type="dxa" w:w="100"/>
+              <w:bottom w:type="dxa" w:w="60"/>
+              <w:right w:type="dxa" w:w="100"/>
+            </w:tcMar>
+          </w:tcPr>
+          <w:p>
+            <w:r>
+              <w:rPr>
+                <w:rFonts w:ascii="Consolas" w:cs="Consolas" w:eastAsia="Consolas" w:hAnsi="Consolas"/>
+                <w:color w:val="1B2A4A"/>
+                <w:sz w:val="19"/>
+                <w:szCs w:val="19"/>
+              </w:rPr>
+              <w:t xml:space="preserve">gobierno.html</w:t>
+            </w:r>
+            <w:r>
+              <w:rPr>
+                <w:sz w:val="19"/>
+                <w:szCs w:val="19"/>
+              </w:rPr>
+              <w:t xml:space="preserve"> · Inicio</w:t>
+            </w:r>
+          </w:p>
+        </w:tc>
+      </w:tr>
+      <w:tr>
+        <w:tc>
+          <w:tcPr>
+            <w:tcW w:type="dxa" w:w="2061"/>
+            <w:tcBorders>
+              <w:top w:val="single" w:color="C9CED8" w:sz="4"/>
+              <w:left w:val="single" w:color="C9CED8" w:sz="4"/>
+              <w:bottom w:val="single" w:color="C9CED8" w:sz="4"/>
+              <w:right w:val="single" w:color="C9CED8" w:sz="4"/>
+            </w:tcBorders>
+            <w:tcMar>
+              <w:top w:type="dxa" w:w="60"/>
+              <w:left w:type="dxa" w:w="100"/>
+              <w:bottom w:type="dxa" w:w="60"/>
+              <w:right w:type="dxa" w:w="100"/>
+            </w:tcMar>
+          </w:tcPr>
+          <w:p>
+            <w:r>
+              <w:rPr>
+                <w:sz w:val="19"/>
+                <w:szCs w:val="19"/>
+              </w:rPr>
+              <w:t xml:space="preserve">15-34</w:t>
+            </w:r>
+          </w:p>
+        </w:tc>
+        <w:tc>
+          <w:tcPr>
+            <w:tcW w:type="dxa" w:w="4007"/>
+            <w:tcBorders>
+              <w:top w:val="single" w:color="C9CED8" w:sz="4"/>
+              <w:left w:val="single" w:color="C9CED8" w:sz="4"/>
+              <w:bottom w:val="single" w:color="C9CED8" w:sz="4"/>
+              <w:right w:val="single" w:color="C9CED8" w:sz="4"/>
+            </w:tcBorders>
+            <w:tcMar>
+              <w:top w:type="dxa" w:w="60"/>
+              <w:left w:type="dxa" w:w="100"/>
+              <w:bottom w:type="dxa" w:w="60"/>
+              <w:right w:type="dxa" w:w="100"/>
+            </w:tcMar>
+          </w:tcPr>
+          <w:p>
+            <w:r>
+              <w:rPr>
+                <w:sz w:val="19"/>
+                <w:szCs w:val="19"/>
+              </w:rPr>
+              <w:t xml:space="preserve">6. Parte 2 · Gobierno (pasos 6-18)</w:t>
+            </w:r>
+          </w:p>
+        </w:tc>
+        <w:tc>
+          <w:tcPr>
+            <w:tcW w:type="dxa" w:w="3570"/>
+            <w:tcBorders>
+              <w:top w:val="single" w:color="C9CED8" w:sz="4"/>
+              <w:left w:val="single" w:color="C9CED8" w:sz="4"/>
+              <w:bottom w:val="single" w:color="C9CED8" w:sz="4"/>
+              <w:right w:val="single" w:color="C9CED8" w:sz="4"/>
+            </w:tcBorders>
+            <w:tcMar>
+              <w:top w:type="dxa" w:w="60"/>
+              <w:left w:type="dxa" w:w="100"/>
+              <w:bottom w:type="dxa" w:w="60"/>
+              <w:right w:type="dxa" w:w="100"/>
+            </w:tcMar>
+          </w:tcPr>
+          <w:p>
+            <w:r>
+              <w:rPr>
+                <w:rFonts w:ascii="Consolas" w:cs="Consolas" w:eastAsia="Consolas" w:hAnsi="Consolas"/>
+                <w:color w:val="1B2A4A"/>
+                <w:sz w:val="19"/>
+                <w:szCs w:val="19"/>
+              </w:rPr>
+              <w:t xml:space="preserve">gobierno.html</w:t>
+            </w:r>
+          </w:p>
+        </w:tc>
+      </w:tr>
+      <w:tr>
+        <w:tc>
+          <w:tcPr>
+            <w:tcW w:type="dxa" w:w="2061"/>
+            <w:tcBorders>
+              <w:top w:val="single" w:color="C9CED8" w:sz="4"/>
+              <w:left w:val="single" w:color="C9CED8" w:sz="4"/>
+              <w:bottom w:val="single" w:color="C9CED8" w:sz="4"/>
+              <w:right w:val="single" w:color="C9CED8" w:sz="4"/>
+            </w:tcBorders>
+            <w:tcMar>
+              <w:top w:type="dxa" w:w="60"/>
+              <w:left w:type="dxa" w:w="100"/>
+              <w:bottom w:type="dxa" w:w="60"/>
+              <w:right w:type="dxa" w:w="100"/>
+            </w:tcMar>
+          </w:tcPr>
+          <w:p>
+            <w:r>
+              <w:rPr>
+                <w:sz w:val="19"/>
+                <w:szCs w:val="19"/>
+              </w:rPr>
               <w:t xml:space="preserve">34-35</w:t>
             </w:r>
           </w:p>
@@ -1775,7 +1977,7 @@
                 <w:sz w:val="19"/>
                 <w:szCs w:val="19"/>
               </w:rPr>
-              <w:t xml:space="preserve">5. Cierre</w:t>
+              <w:t xml:space="preserve">7. Cierre</w:t>
             </w:r>
           </w:p>
         </w:tc>
@@ -1836,7 +2038,7 @@
       </w:pPr>
       <w:bookmarkStart w:name="_Toc2" w:id="2"/>
       <w:r>
-        <w:t xml:space="preserve">1. FNOL: de qué hablamos (≈1 min)</w:t>
+        <w:t xml:space="preserve">1. El problema: FNOL, un proceso crítico, y el gobierno de la IA (≈1 min)</w:t>
       </w:r>
       <w:bookmarkEnd w:id="2"/>
     </w:p>
@@ -1861,10 +2063,10 @@
           <w:sz w:val="20"/>
           <w:szCs w:val="20"/>
         </w:rPr>
-        <w:t xml:space="preserve">intro-fnol.html</w:t>
-      </w:r>
-      <w:r>
-        <w:t xml:space="preserve">.</w:t>
+        <w:t xml:space="preserve">intro.html</w:t>
+      </w:r>
+      <w:r>
+        <w:t xml:space="preserve"> · El problema.</w:t>
       </w:r>
     </w:p>
     <w:p>
@@ -1886,7 +2088,7 @@
           <w:iCs/>
           <w:color w:val="1E7B34"/>
         </w:rPr>
-        <w:t xml:space="preserve">«El primer aviso decide buena parte de lo que pasa con el siniestro.»</w:t>
+        <w:t xml:space="preserve">«El primer aviso decide buena parte de lo que pasa con el siniestro, y la IA que lo automatice tiene que estar bajo control.»</w:t>
       </w:r>
     </w:p>
     <w:p>
@@ -1955,6 +2157,40 @@
           <w:szCs w:val="23"/>
         </w:rPr>
         <w:t xml:space="preserve">Hoy todo ese trabajo lo hace una persona: lee el mensaje, lo clasifica y teclea los datos en el sistema. Para que os hagáis una idea del peso que tiene, en Estados Unidos la gestión de siniestros se lleva en torno al 10 % de la prima de Auto. Ahí es donde se nos va el tiempo y el dinero.</w:t>
+      </w:r>
+    </w:p>
+    <w:p>
+      <w:pPr>
+        <w:pBdr>
+          <w:left w:val="single" w:color="1E7B34" w:sz="18" w:space="8"/>
+        </w:pBdr>
+        <w:spacing w:after="120" w:before="60" w:line="300"/>
+        <w:ind w:left="284"/>
+      </w:pPr>
+      <w:r>
+        <w:rPr>
+          <w:color w:val="1E7B34"/>
+          <w:sz w:val="23"/>
+          <w:szCs w:val="23"/>
+        </w:rPr>
+        <w:t xml:space="preserve">Y hay un segundo problema. En cuanto metemos IA en un proceso así, hay que controlarla desde muchos ángulos: cuánta autonomía damos a los agentes, si las bases de conocimiento que usan están sanas, si cumplimos la normativa y cuánto nos cuesta cada decisión.</w:t>
+      </w:r>
+    </w:p>
+    <w:p>
+      <w:pPr>
+        <w:pBdr>
+          <w:left w:val="single" w:color="1E7B34" w:sz="18" w:space="8"/>
+        </w:pBdr>
+        <w:spacing w:after="120" w:before="60" w:line="300"/>
+        <w:ind w:left="284"/>
+      </w:pPr>
+      <w:r>
+        <w:rPr>
+          <w:color w:val="1E7B34"/>
+          <w:sz w:val="23"/>
+          <w:szCs w:val="23"/>
+        </w:rPr>
+        <w:t xml:space="preserve">Hoy clasificar un mensaje con IA ya no diferencia a nadie; con un buen prompt se consigue más de un 90 % de acierto. El reto de verdad está en pasar del piloto a producción. Gartner estima que más del 40 % de los proyectos de IA agéntica se van a cancelar antes de que acabe 2027, por coste, por un valor poco claro o por riesgos sin controlar. Es decir, los proyectos no se caen porque la IA falle. Se caen porque nadie sabe responder a tres preguntas: por qué ha decidido eso, quién lo controla y cuánto cuesta.</w:t>
       </w:r>
     </w:p>
     <w:p>
@@ -2014,7 +2250,7 @@
       </w:pPr>
       <w:bookmarkStart w:name="_Toc3" w:id="3"/>
       <w:r>
-        <w:t xml:space="preserve">2. El sistema que vais a ver (≈4 min)</w:t>
+        <w:t xml:space="preserve">2. La solución: una plataforma multicanal integrada, orquestada por 4 agentes y con un buen gobierno de la IA (≈2 min)</w:t>
       </w:r>
       <w:bookmarkEnd w:id="3"/>
     </w:p>
@@ -2039,10 +2275,10 @@
           <w:sz w:val="20"/>
           <w:szCs w:val="20"/>
         </w:rPr>
-        <w:t xml:space="preserve">intro-sistema.html</w:t>
-      </w:r>
-      <w:r>
-        <w:t xml:space="preserve">, bloque a bloque de arriba abajo.</w:t>
+        <w:t xml:space="preserve">intro.html</w:t>
+      </w:r>
+      <w:r>
+        <w:t xml:space="preserve"> · La solución, bloque a bloque de arriba abajo.</w:t>
       </w:r>
     </w:p>
     <w:p>
@@ -2152,7 +2388,7 @@
           <w:sz w:val="23"/>
           <w:szCs w:val="23"/>
         </w:rPr>
-        <w:t xml:space="preserve">Lo que os vamos a enseñar hoy automatiza ese primer contacto. Tenemos cuatro agentes de IA que reciben el aviso por cualquier canal, deciden a qué ramo pertenece, extraen los datos y aplican las reglas de negocio de la aseguradora. Al tramitador le llega el aviso ya clasificado, con los datos extraídos y con una propuesta: aprobado o a revisar.</w:t>
+        <w:t xml:space="preserve">Lo que os vamos a enseñar hoy es una plataforma integrada que automatiza ese primer contacto. Tenemos cuatro agentes de IA que reciben el aviso por cualquier canal, deciden a qué ramo pertenece, extraen los datos y aplican las reglas de negocio de la aseguradora. Al tramitador le llega el aviso ya clasificado, con los datos extraídos y con una propuesta: aprobado o a revisar.</w:t>
       </w:r>
     </w:p>
     <w:p>
@@ -2170,6 +2406,23 @@
           <w:szCs w:val="23"/>
         </w:rPr>
         <w:t xml:space="preserve">En el lote que vamos a procesar entran 13 avisos. 10 se aprueban solos y 3 pasan a una persona, cada uno con su motivo y con la frase del cliente que lo justifica.</w:t>
+      </w:r>
+    </w:p>
+    <w:p>
+      <w:pPr>
+        <w:pBdr>
+          <w:left w:val="single" w:color="1E7B34" w:sz="18" w:space="8"/>
+        </w:pBdr>
+        <w:spacing w:after="120" w:before="60" w:line="300"/>
+        <w:ind w:left="284"/>
+      </w:pPr>
+      <w:r>
+        <w:rPr>
+          <w:color w:val="1E7B34"/>
+          <w:sz w:val="23"/>
+          <w:szCs w:val="23"/>
+        </w:rPr>
+        <w:t xml:space="preserve">Y así se ve el panel de gobierno en los últimos 14 días: 16.720 mensajes procesados, un 81 % de autonomía efectiva, un 19 % escalado a una persona y solo un 2,1 % de decisiones corregidas por un tramitador. Al lado, el coste del periodo, las alertas activas, el cumplimiento y la salud de las bases de conocimiento.</w:t>
       </w:r>
     </w:p>
     <w:p>
@@ -2780,9 +3033,33 @@
       </w:pPr>
       <w:bookmarkStart w:name="_Toc7" w:id="7"/>
       <w:r>
-        <w:t xml:space="preserve">2.4 Dos usuarios, dos pantallas</w:t>
+        <w:t xml:space="preserve">2.4 La trazabilidad, base del gobierno</w:t>
       </w:r>
       <w:bookmarkEnd w:id="7"/>
+    </w:p>
+    <w:p>
+      <w:pPr>
+        <w:spacing w:after="120"/>
+      </w:pPr>
+      <w:r>
+        <w:t xml:space="preserve">Cinco ideas, una por bloque de la página:</w:t>
+      </w:r>
+    </w:p>
+    <w:p>
+      <w:pPr>
+        <w:keepNext/>
+        <w:spacing w:after="80" w:before="200"/>
+      </w:pPr>
+      <w:r>
+        <w:rPr>
+          <w:b/>
+          <w:bCs/>
+          <w:color w:val="1B2A4A"/>
+          <w:sz w:val="22"/>
+          <w:szCs w:val="22"/>
+        </w:rPr>
+        <w:t xml:space="preserve">Trazabilidad: la base de todo</w:t>
+      </w:r>
     </w:p>
     <w:p>
       <w:pPr>
@@ -2798,19 +3075,24 @@
           <w:sz w:val="23"/>
           <w:szCs w:val="23"/>
         </w:rPr>
-        <w:t xml:space="preserve">La solución tiene dos tipos de usuario. Por un lado está el tramitador, que trabaja en la pantalla de triaje: ve cada aviso y entiende por qué se ha aprobado o por qué le ha llegado a él. Por otro lado están las personas que gobiernan la IA, ya sea el Comité de IA, Riesgos, Auditoría, el DPO o Finanzas, que trabajan en el panel de gobierno. Desde ahí ven si los agentes deciden bien, cuánto cuestan y si la aseguradora puede demostrar que cumple.</w:t>
-      </w:r>
-    </w:p>
-    <w:p>
-      <w:pPr>
-        <w:pStyle w:val="Heading2"/>
+        <w:t xml:space="preserve">La base de todo es la trazabilidad. Cada decisión deja una traza: qué entró, qué hizo cada agente, con qué modelo, cuántos tokens gastó, cuánto costó y qué decidió. Los proveedores de IA ya ofrecen trazas técnicas, y son necesarias, pero no entienden qué es un ramo, una franquicia o un plazo de siete días. Lo que hace esta solución es juntar los dos mundos, la traza técnica y el proceso de negocio de la aseguradora, para dar una respuesta adaptada a cada compañía. Y sobre esa traza construimos todo lo demás: el control de la autonomía y del gasto, la auditoría y el replay.</w:t>
+      </w:r>
+    </w:p>
+    <w:p>
+      <w:pPr>
         <w:keepNext/>
-      </w:pPr>
-      <w:bookmarkStart w:name="_Toc8" w:id="8"/>
-      <w:r>
-        <w:t xml:space="preserve">2.5 Por qué el gobierno decide el éxito</w:t>
-      </w:r>
-      <w:bookmarkEnd w:id="8"/>
+        <w:spacing w:after="80" w:before="200"/>
+      </w:pPr>
+      <w:r>
+        <w:rPr>
+          <w:b/>
+          <w:bCs/>
+          <w:color w:val="1B2A4A"/>
+          <w:sz w:val="22"/>
+          <w:szCs w:val="22"/>
+        </w:rPr>
+        <w:t xml:space="preserve">Autonomía y madurez de los agentes</w:t>
+      </w:r>
     </w:p>
     <w:p>
       <w:pPr>
@@ -2826,15 +3108,7 @@
           <w:sz w:val="23"/>
           <w:szCs w:val="23"/>
         </w:rPr>
-        <w:t xml:space="preserve">Hoy clasificar un mensaje con IA ya no diferencia a nadie; con un buen prompt se consigue más de un 90 % de acierto. El reto de verdad está en pasar del piloto a producción. Gartner estima que más del 40 % de los proyectos de IA agéntica se van a cancelar antes de que acabe 2027, por coste, por un valor poco claro o por riesgos sin controlar. Es decir, los proyectos no se caen porque la IA falle. Se caen porque nadie sabe responder a tres preguntas: por qué ha decidido eso, quién lo controla y cuánto cuesta.</w:t>
-      </w:r>
-    </w:p>
-    <w:p>
-      <w:pPr>
-        <w:spacing w:after="120"/>
-      </w:pPr>
-      <w:r>
-        <w:t xml:space="preserve">Cinco ideas, una por bloque de la página:</w:t>
+        <w:t xml:space="preserve">Cada agente tiene un nivel de autonomía, que va de L0, donde solo sugiere, a L3, donde decide y ejecuta. Esa autonomía se gana con datos y se pierde con datos. Cuando los tramitadores empezaron a corregir más del 3 % de las decisiones del agente de Reglas, el agente bajó de L3 a L2, con su motivo y con el nombre de quien lo aprobó. Hoy el 81 % de las decisiones sale sin intervención humana, y mantener ese porcentaje con control es lo que de verdad significa que la automatización funciona.</w:t>
       </w:r>
     </w:p>
     <w:p>
@@ -2850,7 +3124,7 @@
           <w:sz w:val="22"/>
           <w:szCs w:val="22"/>
         </w:rPr>
-        <w:t xml:space="preserve">Trazabilidad: la base de todo</w:t>
+        <w:t xml:space="preserve">Gasto bajo control</w:t>
       </w:r>
     </w:p>
     <w:p>
@@ -2867,7 +3141,7 @@
           <w:sz w:val="23"/>
           <w:szCs w:val="23"/>
         </w:rPr>
-        <w:t xml:space="preserve">La base de todo es la trazabilidad. Cada decisión deja una traza: qué entró, qué hizo cada agente, con qué modelo, cuántos tokens gastó, cuánto costó y qué decidió. Los proveedores de IA ya ofrecen trazas técnicas, y son necesarias, pero no entienden qué es un ramo, una franquicia o un plazo de siete días. Lo que hace esta solución es juntar los dos mundos, la traza técnica y el proceso de negocio de la aseguradora, para dar una respuesta adaptada a cada compañía. Y sobre esa traza construimos todo lo demás: el control de la autonomía y del gasto, la auditoría y el replay.</w:t>
+        <w:t xml:space="preserve">El gasto lo controlamos al segundo y en base a acciones. Los proveedores de servicios de IA empresarial te dicen cuánto has gastado cada 8 horas, y en 8 horas pueden pasar muchas cosas: un agente que entra en bucle o un pico de mensajes nos puede hacer levantarnos por la mañana con un gasto que no queríamos. Aquí cada decisión suma su coste en el momento en que se produce, y cada agente tiene sus topes. Si se supera uno, el sistema actúa solo: por ejemplo, pasa a un modelo más barato y lo deja anotado en cada traza, sin parar el servicio.</w:t>
       </w:r>
     </w:p>
     <w:p>
@@ -2883,7 +3157,7 @@
           <w:sz w:val="22"/>
           <w:szCs w:val="22"/>
         </w:rPr>
-        <w:t xml:space="preserve">Autonomía y madurez de los agentes</w:t>
+        <w:t xml:space="preserve">Fraude</w:t>
       </w:r>
     </w:p>
     <w:p>
@@ -2900,7 +3174,7 @@
           <w:sz w:val="23"/>
           <w:szCs w:val="23"/>
         </w:rPr>
-        <w:t xml:space="preserve">Cada agente tiene un nivel de autonomía, que va de L0, donde solo sugiere, a L3, donde decide y ejecuta. Esa autonomía se gana con datos y se pierde con datos. Cuando los tramitadores empezaron a corregir más del 3 % de las decisiones del agente de Reglas, el agente bajó de L3 a L2, con su motivo y con el nombre de quien lo aprobó. Hoy el 81 % de las decisiones sale sin intervención humana, y mantener ese porcentaje con control es lo que de verdad significa que la automatización funciona.</w:t>
+        <w:t xml:space="preserve">Para el fraude, la plataforma combina lo que entiende la IA del relato del cliente con el histórico de pólizas y siniestros y con reglas deterministas. Con todo eso identifica los patrones de fraude que la compañía ya conoce: una póliza recién contratada, una cuenta de cobro que se repite entre asegurados distintos o un robo sin denuncia. Y algo importante: el indicio no acusa, prioriza. La decisión siempre la toma una persona.</w:t>
       </w:r>
     </w:p>
     <w:p>
@@ -2916,7 +3190,7 @@
           <w:sz w:val="22"/>
           <w:szCs w:val="22"/>
         </w:rPr>
-        <w:t xml:space="preserve">Gasto bajo control</w:t>
+        <w:t xml:space="preserve">Cumplimiento demostrable</w:t>
       </w:r>
     </w:p>
     <w:p>
@@ -2933,23 +3207,75 @@
           <w:sz w:val="23"/>
           <w:szCs w:val="23"/>
         </w:rPr>
-        <w:t xml:space="preserve">El gasto lo controlamos al segundo y en base a acciones. Los proveedores de servicios de IA empresarial te dicen cuánto has gastado cada 8 horas, y en 8 horas pueden pasar muchas cosas: un agente que entra en bucle o un pico de mensajes nos puede hacer levantarnos por la mañana con un gasto que no queríamos. Aquí cada decisión suma su coste en el momento en que se produce, y cada agente tiene sus topes. Si se supera uno, el sistema actúa solo: por ejemplo, pasa a un modelo más barato y lo deja anotado en cada traza, sin parar el servicio.</w:t>
-      </w:r>
-    </w:p>
-    <w:p>
-      <w:pPr>
-        <w:keepNext/>
-        <w:spacing w:after="80" w:before="200"/>
-      </w:pPr>
-      <w:r>
-        <w:rPr>
-          <w:b/>
-          <w:bCs/>
+        <w:t xml:space="preserve">El RGPD, DORA y la opinión de EIOPA sobre IA ya están en vigor. El Reglamento de IA llega después, y el triaje no se considera de alto riesgo, pero aplicamos sus artículos como buena práctica. Cada decisión lleva pegada su prueba de cumplimiento: qué datos personales había, por qué se decidió así y si la revisó una persona.</w:t>
+      </w:r>
+    </w:p>
+    <w:p>
+      <w:pPr>
+        <w:pBdr>
+          <w:bottom w:val="single" w:color="C9CED8" w:sz="6" w:space="1"/>
+        </w:pBdr>
+        <w:spacing w:after="240" w:before="120"/>
+      </w:pPr>
+    </w:p>
+    <w:p>
+      <w:pPr>
+        <w:pStyle w:val="Heading1"/>
+        <w:pageBreakBefore/>
+      </w:pPr>
+      <w:bookmarkStart w:name="_Toc8" w:id="8"/>
+      <w:r>
+        <w:t xml:space="preserve">3. Los actores: el tramitador y los equipos de IT, Finanzas, Compliance, etc. (≈1 min)</w:t>
+      </w:r>
+      <w:bookmarkEnd w:id="8"/>
+    </w:p>
+    <w:p>
+      <w:pPr>
+        <w:spacing w:after="120"/>
+      </w:pPr>
+      <w:r>
+        <w:rPr>
+          <w:b/>
+          <w:bCs/>
+        </w:rPr>
+        <w:t xml:space="preserve">Pantalla:</w:t>
+      </w:r>
+      <w:r>
+        <w:t xml:space="preserve"> </w:t>
+      </w:r>
+      <w:r>
+        <w:rPr>
+          <w:rFonts w:ascii="Consolas" w:cs="Consolas" w:eastAsia="Consolas" w:hAnsi="Consolas"/>
           <w:color w:val="1B2A4A"/>
-          <w:sz w:val="22"/>
-          <w:szCs w:val="22"/>
-        </w:rPr>
-        <w:t xml:space="preserve">Fraude</w:t>
+          <w:sz w:val="20"/>
+          <w:szCs w:val="20"/>
+        </w:rPr>
+        <w:t xml:space="preserve">intro.html</w:t>
+      </w:r>
+      <w:r>
+        <w:t xml:space="preserve"> · Los actores.</w:t>
+      </w:r>
+    </w:p>
+    <w:p>
+      <w:pPr>
+        <w:spacing w:after="120" w:before="80"/>
+      </w:pPr>
+      <w:r>
+        <w:rPr>
+          <w:b/>
+          <w:bCs/>
+        </w:rPr>
+        <w:t xml:space="preserve">Frase clave: </w:t>
+      </w:r>
+      <w:r>
+        <w:rPr>
+          <w:b/>
+          <w:bCs/>
+          <w:i/>
+          <w:iCs/>
+          <w:color w:val="1E7B34"/>
+        </w:rPr>
+        <w:t xml:space="preserve">«Dos actores, dos pantallas: el tramitador y quien gobierna la IA.»</w:t>
       </w:r>
     </w:p>
     <w:p>
@@ -2966,23 +3292,7 @@
           <w:sz w:val="23"/>
           <w:szCs w:val="23"/>
         </w:rPr>
-        <w:t xml:space="preserve">Para el fraude, la plataforma combina lo que entiende la IA del relato del cliente con el histórico de pólizas y siniestros y con reglas deterministas. Con todo eso identifica los patrones de fraude que la compañía ya conoce: una póliza recién contratada, una cuenta de cobro que se repite entre asegurados distintos o un robo sin denuncia. Y algo importante: el indicio no acusa, prioriza. La decisión siempre la toma una persona.</w:t>
-      </w:r>
-    </w:p>
-    <w:p>
-      <w:pPr>
-        <w:keepNext/>
-        <w:spacing w:after="80" w:before="200"/>
-      </w:pPr>
-      <w:r>
-        <w:rPr>
-          <w:b/>
-          <w:bCs/>
-          <w:color w:val="1B2A4A"/>
-          <w:sz w:val="22"/>
-          <w:szCs w:val="22"/>
-        </w:rPr>
-        <w:t xml:space="preserve">Cumplimiento demostrable</w:t>
+        <w:t xml:space="preserve">En la demo vamos a ver dos tipos de usuario. Por un lado está el tramitador de FNOL, que trabaja en la pantalla de triaje. Es una interfaz muy ágil: ve el detalle de cada mensaje, cómo y por qué se ha clasificado, por qué la IA ha tomado cada decisión y los indicios de fraude, con la frase del cliente que los justifica. Así dedica su tiempo a los casos que necesitan criterio.</w:t>
       </w:r>
     </w:p>
     <w:p>
@@ -2999,23 +3309,75 @@
           <w:sz w:val="23"/>
           <w:szCs w:val="23"/>
         </w:rPr>
-        <w:t xml:space="preserve">El RGPD, DORA y la opinión de EIOPA sobre IA ya están en vigor. El Reglamento de IA llega después, y el triaje no se considera de alto riesgo, pero aplicamos sus artículos como buena práctica. Cada decisión lleva pegada su prueba de cumplimiento: qué datos personales había, por qué se decidió así y si la revisó una persona.</w:t>
-      </w:r>
-    </w:p>
-    <w:p>
-      <w:pPr>
-        <w:keepNext/>
-        <w:spacing w:after="80" w:before="200"/>
-      </w:pPr>
-      <w:r>
-        <w:rPr>
-          <w:b/>
-          <w:bCs/>
+        <w:t xml:space="preserve">Por otro lado están los equipos que gobiernan la IA: IT, Finanzas, Compliance, Riesgos, Auditoría o el DPO, que trabajan en el panel de gobierno. Desde ahí ven si los agentes deciden bien, con qué conocimiento, cuánto cuestan y si la aseguradora puede demostrar que cumple.</w:t>
+      </w:r>
+    </w:p>
+    <w:p>
+      <w:pPr>
+        <w:pBdr>
+          <w:bottom w:val="single" w:color="C9CED8" w:sz="6" w:space="1"/>
+        </w:pBdr>
+        <w:spacing w:after="240" w:before="120"/>
+      </w:pPr>
+    </w:p>
+    <w:p>
+      <w:pPr>
+        <w:pStyle w:val="Heading1"/>
+        <w:pageBreakBefore/>
+      </w:pPr>
+      <w:bookmarkStart w:name="_Toc9" w:id="9"/>
+      <w:r>
+        <w:t xml:space="preserve">4. La demo: un viaje desde que llega un mensaje hasta el panel de gobierno (≈1 min)</w:t>
+      </w:r>
+      <w:bookmarkEnd w:id="9"/>
+    </w:p>
+    <w:p>
+      <w:pPr>
+        <w:spacing w:after="120"/>
+      </w:pPr>
+      <w:r>
+        <w:rPr>
+          <w:b/>
+          <w:bCs/>
+        </w:rPr>
+        <w:t xml:space="preserve">Pantalla:</w:t>
+      </w:r>
+      <w:r>
+        <w:t xml:space="preserve"> </w:t>
+      </w:r>
+      <w:r>
+        <w:rPr>
+          <w:rFonts w:ascii="Consolas" w:cs="Consolas" w:eastAsia="Consolas" w:hAnsi="Consolas"/>
           <w:color w:val="1B2A4A"/>
-          <w:sz w:val="22"/>
-          <w:szCs w:val="22"/>
-        </w:rPr>
-        <w:t xml:space="preserve">Puente a la demo</w:t>
+          <w:sz w:val="20"/>
+          <w:szCs w:val="20"/>
+        </w:rPr>
+        <w:t xml:space="preserve">intro.html</w:t>
+      </w:r>
+      <w:r>
+        <w:t xml:space="preserve"> · La demo.</w:t>
+      </w:r>
+    </w:p>
+    <w:p>
+      <w:pPr>
+        <w:spacing w:after="120" w:before="80"/>
+      </w:pPr>
+      <w:r>
+        <w:rPr>
+          <w:b/>
+          <w:bCs/>
+        </w:rPr>
+        <w:t xml:space="preserve">Frase clave: </w:t>
+      </w:r>
+      <w:r>
+        <w:rPr>
+          <w:b/>
+          <w:bCs/>
+          <w:i/>
+          <w:iCs/>
+          <w:color w:val="1E7B34"/>
+        </w:rPr>
+        <w:t xml:space="preserve">«Seguimos un mensaje de principio a fin y vemos todo lo que la IA deja detrás.»</w:t>
       </w:r>
     </w:p>
     <w:p>
@@ -3032,6 +3394,56 @@
           <w:sz w:val="23"/>
           <w:szCs w:val="23"/>
         </w:rPr>
+        <w:t xml:space="preserve">La demo es un viaje. Empieza cuando llega un mensaje, sigue con su análisis por los agentes y con la revisión del tramitador, y pasa por las evidencias que deja la IA en cada decisión.</w:t>
+      </w:r>
+    </w:p>
+    <w:p>
+      <w:pPr>
+        <w:pBdr>
+          <w:left w:val="single" w:color="1E7B34" w:sz="18" w:space="8"/>
+        </w:pBdr>
+        <w:spacing w:after="120" w:before="60" w:line="300"/>
+        <w:ind w:left="284"/>
+      </w:pPr>
+      <w:r>
+        <w:rPr>
+          <w:color w:val="1E7B34"/>
+          <w:sz w:val="23"/>
+          <w:szCs w:val="23"/>
+        </w:rPr>
+        <w:t xml:space="preserve">Y termina en el panel de gobierno, donde vamos a entender qué agentes intervinieron, qué hicieron y cómo, qué límites tenían, qué razonamiento hay debajo, qué conocimiento usaron, cómo de compliance es la solución, cuándo gasta y por qué, y cómo podemos mejorarlo todo.</w:t>
+      </w:r>
+    </w:p>
+    <w:p>
+      <w:pPr>
+        <w:keepNext/>
+        <w:spacing w:after="80" w:before="200"/>
+      </w:pPr>
+      <w:r>
+        <w:rPr>
+          <w:b/>
+          <w:bCs/>
+          <w:color w:val="1B2A4A"/>
+          <w:sz w:val="22"/>
+          <w:szCs w:val="22"/>
+        </w:rPr>
+        <w:t xml:space="preserve">Puente a la demo</w:t>
+      </w:r>
+    </w:p>
+    <w:p>
+      <w:pPr>
+        <w:pBdr>
+          <w:left w:val="single" w:color="1E7B34" w:sz="18" w:space="8"/>
+        </w:pBdr>
+        <w:spacing w:after="120" w:before="60" w:line="300"/>
+        <w:ind w:left="284"/>
+      </w:pPr>
+      <w:r>
+        <w:rPr>
+          <w:color w:val="1E7B34"/>
+          <w:sz w:val="23"/>
+          <w:szCs w:val="23"/>
+        </w:rPr>
         <w:t xml:space="preserve">Vamos a verlo. Primero os enseño lo que ve el tramitador y después lo que ve quien gobierna la IA: el responsable de los agentes, el auditor y el CFO.</w:t>
       </w:r>
     </w:p>
@@ -3075,22 +3487,22 @@
         <w:pStyle w:val="Heading1"/>
         <w:pageBreakBefore/>
       </w:pPr>
-      <w:bookmarkStart w:name="_Toc9" w:id="9"/>
-      <w:r>
-        <w:t xml:space="preserve">3. Parte 1 · Triaje</w:t>
-      </w:r>
-      <w:bookmarkEnd w:id="9"/>
+      <w:bookmarkStart w:name="_Toc10" w:id="10"/>
+      <w:r>
+        <w:t xml:space="preserve">5. Parte 1 · Triaje</w:t>
+      </w:r>
+      <w:bookmarkEnd w:id="10"/>
     </w:p>
     <w:p>
       <w:pPr>
         <w:pStyle w:val="Heading2"/>
         <w:keepNext/>
       </w:pPr>
-      <w:bookmarkStart w:name="_Toc10" w:id="10"/>
+      <w:bookmarkStart w:name="_Toc11" w:id="11"/>
       <w:r>
         <w:t xml:space="preserve">Paso 1 · Las seis fases y los cinco canales (min 5-6:30)</w:t>
       </w:r>
-      <w:bookmarkEnd w:id="10"/>
+      <w:bookmarkEnd w:id="11"/>
     </w:p>
     <w:p>
       <w:pPr>
@@ -3720,11 +4132,11 @@
         <w:pStyle w:val="Heading2"/>
         <w:keepNext/>
       </w:pPr>
-      <w:bookmarkStart w:name="_Toc11" w:id="11"/>
+      <w:bookmarkStart w:name="_Toc12" w:id="12"/>
       <w:r>
         <w:t xml:space="preserve">Paso 2 · Procesar el Paquete A (min 6:30-8:30)</w:t>
       </w:r>
-      <w:bookmarkEnd w:id="11"/>
+      <w:bookmarkEnd w:id="12"/>
     </w:p>
     <w:p>
       <w:pPr>
@@ -4145,11 +4557,11 @@
         <w:pStyle w:val="Heading2"/>
         <w:keepNext/>
       </w:pPr>
-      <w:bookmarkStart w:name="_Toc12" w:id="12"/>
+      <w:bookmarkStart w:name="_Toc13" w:id="13"/>
       <w:r>
         <w:t xml:space="preserve">Paso 3 · La ficha de un aprobado: MSG-A-01 (min 8:30-10)</w:t>
       </w:r>
-      <w:bookmarkEnd w:id="12"/>
+      <w:bookmarkEnd w:id="13"/>
     </w:p>
     <w:p>
       <w:pPr>
@@ -4654,11 +5066,11 @@
         <w:pStyle w:val="Heading2"/>
         <w:keepNext/>
       </w:pPr>
-      <w:bookmarkStart w:name="_Toc13" w:id="13"/>
+      <w:bookmarkStart w:name="_Toc14" w:id="14"/>
       <w:r>
         <w:t xml:space="preserve">Paso 4 · La ficha de un «A revisar»: MSG-A-08 (min 10-12)</w:t>
       </w:r>
-      <w:bookmarkEnd w:id="13"/>
+      <w:bookmarkEnd w:id="14"/>
     </w:p>
     <w:p>
       <w:pPr>
@@ -5138,11 +5550,11 @@
         <w:pStyle w:val="Heading2"/>
         <w:keepNext/>
       </w:pPr>
-      <w:bookmarkStart w:name="_Toc14" w:id="14"/>
+      <w:bookmarkStart w:name="_Toc15" w:id="15"/>
       <w:r>
         <w:t xml:space="preserve">Paso 5 · La respuesta cruda de MSG-A-12 (min 12-14)</w:t>
       </w:r>
-      <w:bookmarkEnd w:id="14"/>
+      <w:bookmarkEnd w:id="15"/>
     </w:p>
     <w:p>
       <w:pPr>
@@ -5751,22 +6163,22 @@
         <w:pStyle w:val="Heading1"/>
         <w:pageBreakBefore/>
       </w:pPr>
-      <w:bookmarkStart w:name="_Toc15" w:id="15"/>
-      <w:r>
-        <w:t xml:space="preserve">4. Parte 2 · Gobierno</w:t>
-      </w:r>
-      <w:bookmarkEnd w:id="15"/>
+      <w:bookmarkStart w:name="_Toc16" w:id="16"/>
+      <w:r>
+        <w:t xml:space="preserve">6. Parte 2 · Gobierno</w:t>
+      </w:r>
+      <w:bookmarkEnd w:id="16"/>
     </w:p>
     <w:p>
       <w:pPr>
         <w:pStyle w:val="Heading2"/>
         <w:keepNext/>
       </w:pPr>
-      <w:bookmarkStart w:name="_Toc16" w:id="16"/>
-      <w:r>
-        <w:t xml:space="preserve">4.0 Entrada al panel (min 14-15)</w:t>
-      </w:r>
-      <w:bookmarkEnd w:id="16"/>
+      <w:bookmarkStart w:name="_Toc17" w:id="17"/>
+      <w:r>
+        <w:t xml:space="preserve">6.0 Entrada al panel (min 14-15)</w:t>
+      </w:r>
+      <w:bookmarkEnd w:id="17"/>
     </w:p>
     <w:p>
       <w:pPr>
@@ -6642,11 +7054,11 @@
         <w:pStyle w:val="Heading2"/>
         <w:keepNext/>
       </w:pPr>
-      <w:bookmarkStart w:name="_Toc17" w:id="17"/>
+      <w:bookmarkStart w:name="_Toc18" w:id="18"/>
       <w:r>
         <w:t xml:space="preserve">Paso 6 · Resumen (min 15-17)</w:t>
       </w:r>
-      <w:bookmarkEnd w:id="17"/>
+      <w:bookmarkEnd w:id="18"/>
     </w:p>
     <w:p>
       <w:pPr>
@@ -7130,11 +7542,11 @@
         <w:pStyle w:val="Heading2"/>
         <w:keepNext/>
       </w:pPr>
-      <w:bookmarkStart w:name="_Toc18" w:id="18"/>
+      <w:bookmarkStart w:name="_Toc19" w:id="19"/>
       <w:r>
         <w:t xml:space="preserve">Paso 7 · Agentes: el agente de Reglas (min 17-18:30)</w:t>
       </w:r>
-      <w:bookmarkEnd w:id="18"/>
+      <w:bookmarkEnd w:id="19"/>
     </w:p>
     <w:p>
       <w:pPr>
@@ -7615,11 +8027,11 @@
         <w:pStyle w:val="Heading2"/>
         <w:keepNext/>
       </w:pPr>
-      <w:bookmarkStart w:name="_Toc19" w:id="19"/>
+      <w:bookmarkStart w:name="_Toc20" w:id="20"/>
       <w:r>
         <w:t xml:space="preserve">Paso 8 · Trazabilidad (min 18:30-19:30)</w:t>
       </w:r>
-      <w:bookmarkEnd w:id="19"/>
+      <w:bookmarkEnd w:id="20"/>
     </w:p>
     <w:p>
       <w:pPr>
@@ -8112,11 +8524,11 @@
         <w:pStyle w:val="Heading2"/>
         <w:keepNext/>
       </w:pPr>
-      <w:bookmarkStart w:name="_Toc20" w:id="20"/>
+      <w:bookmarkStart w:name="_Toc21" w:id="21"/>
       <w:r>
         <w:t xml:space="preserve">Paso 9 · Autonomía (min 19:30-20:30)</w:t>
       </w:r>
-      <w:bookmarkEnd w:id="20"/>
+      <w:bookmarkEnd w:id="21"/>
     </w:p>
     <w:p>
       <w:pPr>
@@ -8464,11 +8876,11 @@
         <w:pStyle w:val="Heading2"/>
         <w:keepNext/>
       </w:pPr>
-      <w:bookmarkStart w:name="_Toc21" w:id="21"/>
+      <w:bookmarkStart w:name="_Toc22" w:id="22"/>
       <w:r>
         <w:t xml:space="preserve">Paso 10 · Guardrails (min 20:30-22)</w:t>
       </w:r>
-      <w:bookmarkEnd w:id="21"/>
+      <w:bookmarkEnd w:id="22"/>
     </w:p>
     <w:p>
       <w:pPr>
@@ -8868,11 +9280,11 @@
         <w:pStyle w:val="Heading2"/>
         <w:keepNext/>
       </w:pPr>
-      <w:bookmarkStart w:name="_Toc22" w:id="22"/>
+      <w:bookmarkStart w:name="_Toc23" w:id="23"/>
       <w:r>
         <w:t xml:space="preserve">Paso 11 · Intervención humana: MSG-A-04 (min 22-24)</w:t>
       </w:r>
-      <w:bookmarkEnd w:id="22"/>
+      <w:bookmarkEnd w:id="23"/>
     </w:p>
     <w:p>
       <w:pPr>
@@ -9428,11 +9840,11 @@
         <w:pStyle w:val="Heading2"/>
         <w:keepNext/>
       </w:pPr>
-      <w:bookmarkStart w:name="_Toc23" w:id="23"/>
+      <w:bookmarkStart w:name="_Toc24" w:id="24"/>
       <w:r>
         <w:t xml:space="preserve">Paso 12 · Fraude: MSG-A-13, MSG-A-09 y MSG-A-02 (min 24-26)</w:t>
       </w:r>
-      <w:bookmarkEnd w:id="23"/>
+      <w:bookmarkEnd w:id="24"/>
     </w:p>
     <w:p>
       <w:pPr>
@@ -10163,11 +10575,11 @@
         <w:pStyle w:val="Heading2"/>
         <w:keepNext/>
       </w:pPr>
-      <w:bookmarkStart w:name="_Toc24" w:id="24"/>
+      <w:bookmarkStart w:name="_Toc25" w:id="25"/>
       <w:r>
         <w:t xml:space="preserve">Paso 13 · Razonamiento y replay (min 26-27:30)</w:t>
       </w:r>
-      <w:bookmarkEnd w:id="24"/>
+      <w:bookmarkEnd w:id="25"/>
     </w:p>
     <w:p>
       <w:pPr>
@@ -10601,11 +11013,11 @@
         <w:pStyle w:val="Heading2"/>
         <w:keepNext/>
       </w:pPr>
-      <w:bookmarkStart w:name="_Toc25" w:id="25"/>
+      <w:bookmarkStart w:name="_Toc26" w:id="26"/>
       <w:r>
         <w:t xml:space="preserve">Paso 14 · Knowledge Bases (min 27:30-29)</w:t>
       </w:r>
-      <w:bookmarkEnd w:id="25"/>
+      <w:bookmarkEnd w:id="26"/>
     </w:p>
     <w:p>
       <w:pPr>
@@ -11068,11 +11480,11 @@
         <w:pStyle w:val="Heading2"/>
         <w:keepNext/>
       </w:pPr>
-      <w:bookmarkStart w:name="_Toc26" w:id="26"/>
+      <w:bookmarkStart w:name="_Toc27" w:id="27"/>
       <w:r>
         <w:t xml:space="preserve">Paso 15 · Cumplimiento: el termómetro (min 29-30:30)</w:t>
       </w:r>
-      <w:bookmarkEnd w:id="26"/>
+      <w:bookmarkEnd w:id="27"/>
     </w:p>
     <w:p>
       <w:pPr>
@@ -11587,11 +11999,11 @@
         <w:pStyle w:val="Heading2"/>
         <w:keepNext/>
       </w:pPr>
-      <w:bookmarkStart w:name="_Toc27" w:id="27"/>
+      <w:bookmarkStart w:name="_Toc28" w:id="28"/>
       <w:r>
         <w:t xml:space="preserve">Paso 16 · FinOps (min 30:30-32)</w:t>
       </w:r>
-      <w:bookmarkEnd w:id="27"/>
+      <w:bookmarkEnd w:id="28"/>
     </w:p>
     <w:p>
       <w:pPr>
@@ -12046,11 +12458,11 @@
         <w:pStyle w:val="Heading2"/>
         <w:keepNext/>
       </w:pPr>
-      <w:bookmarkStart w:name="_Toc28" w:id="28"/>
+      <w:bookmarkStart w:name="_Toc29" w:id="29"/>
       <w:r>
         <w:t xml:space="preserve">Paso 17 · Medidas correctivas (min 32-33:30)</w:t>
       </w:r>
-      <w:bookmarkEnd w:id="28"/>
+      <w:bookmarkEnd w:id="29"/>
     </w:p>
     <w:p>
       <w:pPr>
@@ -12534,11 +12946,11 @@
         <w:pStyle w:val="Heading2"/>
         <w:keepNext/>
       </w:pPr>
-      <w:bookmarkStart w:name="_Toc29" w:id="29"/>
+      <w:bookmarkStart w:name="_Toc30" w:id="30"/>
       <w:r>
         <w:t xml:space="preserve">Paso 18 · Histórico (min 33:30-34)</w:t>
       </w:r>
-      <w:bookmarkEnd w:id="29"/>
+      <w:bookmarkEnd w:id="30"/>
     </w:p>
     <w:p>
       <w:pPr>
@@ -12847,11 +13259,11 @@
         <w:pStyle w:val="Heading1"/>
         <w:pageBreakBefore/>
       </w:pPr>
-      <w:bookmarkStart w:name="_Toc30" w:id="30"/>
-      <w:r>
-        <w:t xml:space="preserve">5. Cierre (min 34-35)</w:t>
-      </w:r>
-      <w:bookmarkEnd w:id="30"/>
+      <w:bookmarkStart w:name="_Toc31" w:id="31"/>
+      <w:r>
+        <w:t xml:space="preserve">7. Cierre (min 34-35)</w:t>
+      </w:r>
+      <w:bookmarkEnd w:id="31"/>
     </w:p>
     <w:p>
       <w:pPr>
@@ -12993,11 +13405,11 @@
         <w:pStyle w:val="Heading1"/>
         <w:pageBreakBefore/>
       </w:pPr>
-      <w:bookmarkStart w:name="_Toc31" w:id="31"/>
+      <w:bookmarkStart w:name="_Toc32" w:id="32"/>
       <w:r>
         <w:t xml:space="preserve">Anexo A · Los 13 mensajes del Paquete A</w:t>
       </w:r>
-      <w:bookmarkEnd w:id="31"/>
+      <w:bookmarkEnd w:id="32"/>
     </w:p>
     <w:tbl>
       <w:tblPr>
@@ -16007,11 +16419,11 @@
         <w:pStyle w:val="Heading1"/>
         <w:pageBreakBefore/>
       </w:pPr>
-      <w:bookmarkStart w:name="_Toc32" w:id="32"/>
+      <w:bookmarkStart w:name="_Toc33" w:id="33"/>
       <w:r>
         <w:t xml:space="preserve">Anexo B · Chuleta de cifras</w:t>
       </w:r>
-      <w:bookmarkEnd w:id="32"/>
+      <w:bookmarkEnd w:id="33"/>
     </w:p>
     <w:tbl>
       <w:tblPr>
@@ -17336,11 +17748,11 @@
         <w:pStyle w:val="Heading1"/>
         <w:pageBreakBefore/>
       </w:pPr>
-      <w:bookmarkStart w:name="_Toc33" w:id="33"/>
+      <w:bookmarkStart w:name="_Toc34" w:id="34"/>
       <w:r>
         <w:t xml:space="preserve">Anexo C · Matices para no pisar charcos</w:t>
       </w:r>
-      <w:bookmarkEnd w:id="33"/>
+      <w:bookmarkEnd w:id="34"/>
     </w:p>
     <w:p>
       <w:pPr>
@@ -17447,11 +17859,11 @@
         <w:pStyle w:val="Heading1"/>
         <w:pageBreakBefore/>
       </w:pPr>
-      <w:bookmarkStart w:name="_Toc34" w:id="34"/>
+      <w:bookmarkStart w:name="_Toc35" w:id="35"/>
       <w:r>
         <w:t xml:space="preserve">Anexo D · Versión de 20 minutos</w:t>
       </w:r>
-      <w:bookmarkEnd w:id="34"/>
+      <w:bookmarkEnd w:id="35"/>
     </w:p>
     <w:tbl>
       <w:tblPr>
@@ -17557,7 +17969,7 @@
                 <w:sz w:val="19"/>
                 <w:szCs w:val="19"/>
               </w:rPr>
-              <w:t xml:space="preserve">Intro: dejar 2.1, 2.2, 2.3 y una frase por idea de 2.5</w:t>
+              <w:t xml:space="preserve">Intro: en La solución, dejar 2.1, 2.2, 2.3 y una frase por idea de 2.4</w:t>
             </w:r>
           </w:p>
         </w:tc>
@@ -17665,7 +18077,7 @@
                 <w:sz w:val="19"/>
                 <w:szCs w:val="19"/>
               </w:rPr>
-              <w:t xml:space="preserve">Entrada al panel (4.0) y «Para qué sirve esta sección»: leer solo la primera frase</w:t>
+              <w:t xml:space="preserve">Entrada al panel (6.0) y «Para qué sirve esta sección»: leer solo la primera frase</w:t>
             </w:r>
           </w:p>
         </w:tc>
@@ -18223,6 +18635,21 @@
     <w:multiLevelType w:val="hybridMultilevel"/>
     <w:lvl w:ilvl="0" w:tentative="1">
       <w:start w:val="1"/>
+      <w:numFmt w:val="bullet"/>
+      <w:lvlText w:val="•"/>
+      <w:lvlJc w:val="left"/>
+      <w:pPr>
+        <w:ind w:left="567" w:hanging="283"/>
+      </w:pPr>
+      <w:rPr>
+        <w:color w:val="1E7B34"/>
+      </w:rPr>
+    </w:lvl>
+  </w:abstractNum>
+  <w:abstractNum w:abstractNumId="4" w15:restartNumberingAfterBreak="0">
+    <w:multiLevelType w:val="hybridMultilevel"/>
+    <w:lvl w:ilvl="0" w:tentative="1">
+      <w:start w:val="1"/>
       <w:numFmt w:val="decimal"/>
       <w:lvlText w:val="%1."/>
       <w:lvlJc w:val="left"/>
@@ -18247,115 +18674,115 @@
     </w:lvlOverride>
   </w:num>
   <w:num w:numId="3">
-    <w:abstractNumId w:val="3"/>
+    <w:abstractNumId w:val="4"/>
     <w:lvlOverride w:ilvl="0">
       <w:startOverride w:val="1"/>
     </w:lvlOverride>
   </w:num>
   <w:num w:numId="4">
-    <w:abstractNumId w:val="3"/>
+    <w:abstractNumId w:val="4"/>
     <w:lvlOverride w:ilvl="0">
       <w:startOverride w:val="1"/>
     </w:lvlOverride>
   </w:num>
   <w:num w:numId="5">
-    <w:abstractNumId w:val="3"/>
+    <w:abstractNumId w:val="4"/>
     <w:lvlOverride w:ilvl="0">
       <w:startOverride w:val="1"/>
     </w:lvlOverride>
   </w:num>
   <w:num w:numId="6">
-    <w:abstractNumId w:val="3"/>
+    <w:abstractNumId w:val="4"/>
     <w:lvlOverride w:ilvl="0">
       <w:startOverride w:val="1"/>
     </w:lvlOverride>
   </w:num>
   <w:num w:numId="7">
-    <w:abstractNumId w:val="3"/>
+    <w:abstractNumId w:val="4"/>
     <w:lvlOverride w:ilvl="0">
       <w:startOverride w:val="1"/>
     </w:lvlOverride>
   </w:num>
   <w:num w:numId="8">
-    <w:abstractNumId w:val="3"/>
+    <w:abstractNumId w:val="4"/>
     <w:lvlOverride w:ilvl="0">
       <w:startOverride w:val="1"/>
     </w:lvlOverride>
   </w:num>
   <w:num w:numId="9">
-    <w:abstractNumId w:val="3"/>
+    <w:abstractNumId w:val="4"/>
     <w:lvlOverride w:ilvl="0">
       <w:startOverride w:val="1"/>
     </w:lvlOverride>
   </w:num>
   <w:num w:numId="10">
-    <w:abstractNumId w:val="3"/>
+    <w:abstractNumId w:val="4"/>
     <w:lvlOverride w:ilvl="0">
       <w:startOverride w:val="1"/>
     </w:lvlOverride>
   </w:num>
   <w:num w:numId="11">
-    <w:abstractNumId w:val="3"/>
+    <w:abstractNumId w:val="4"/>
     <w:lvlOverride w:ilvl="0">
       <w:startOverride w:val="1"/>
     </w:lvlOverride>
   </w:num>
   <w:num w:numId="12">
-    <w:abstractNumId w:val="3"/>
+    <w:abstractNumId w:val="4"/>
     <w:lvlOverride w:ilvl="0">
       <w:startOverride w:val="1"/>
     </w:lvlOverride>
   </w:num>
   <w:num w:numId="13">
-    <w:abstractNumId w:val="3"/>
+    <w:abstractNumId w:val="4"/>
     <w:lvlOverride w:ilvl="0">
       <w:startOverride w:val="1"/>
     </w:lvlOverride>
   </w:num>
   <w:num w:numId="14">
-    <w:abstractNumId w:val="3"/>
+    <w:abstractNumId w:val="4"/>
     <w:lvlOverride w:ilvl="0">
       <w:startOverride w:val="1"/>
     </w:lvlOverride>
   </w:num>
   <w:num w:numId="15">
-    <w:abstractNumId w:val="3"/>
+    <w:abstractNumId w:val="4"/>
     <w:lvlOverride w:ilvl="0">
       <w:startOverride w:val="1"/>
     </w:lvlOverride>
   </w:num>
   <w:num w:numId="16">
-    <w:abstractNumId w:val="3"/>
+    <w:abstractNumId w:val="4"/>
     <w:lvlOverride w:ilvl="0">
       <w:startOverride w:val="1"/>
     </w:lvlOverride>
   </w:num>
   <w:num w:numId="17">
-    <w:abstractNumId w:val="3"/>
+    <w:abstractNumId w:val="4"/>
     <w:lvlOverride w:ilvl="0">
       <w:startOverride w:val="1"/>
     </w:lvlOverride>
   </w:num>
   <w:num w:numId="18">
-    <w:abstractNumId w:val="3"/>
+    <w:abstractNumId w:val="4"/>
     <w:lvlOverride w:ilvl="0">
       <w:startOverride w:val="1"/>
     </w:lvlOverride>
   </w:num>
   <w:num w:numId="19">
-    <w:abstractNumId w:val="3"/>
+    <w:abstractNumId w:val="4"/>
     <w:lvlOverride w:ilvl="0">
       <w:startOverride w:val="1"/>
     </w:lvlOverride>
   </w:num>
   <w:num w:numId="20">
-    <w:abstractNumId w:val="3"/>
+    <w:abstractNumId w:val="4"/>
     <w:lvlOverride w:ilvl="0">
       <w:startOverride w:val="1"/>
     </w:lvlOverride>
   </w:num>
   <w:num w:numId="21">
-    <w:abstractNumId w:val="3"/>
+    <w:abstractNumId w:val="4"/>
     <w:lvlOverride w:ilvl="0">
       <w:startOverride w:val="1"/>
     </w:lvlOverride>

</xml_diff>

<commit_message>
Guías y demo guiada al día con los adjuntos de MSG-A-01
- Guía de referencia: pestaña «Adjuntos» de la ficha, bloque _gobernanza.adjuntos,
  seudonimización solo del texto y adjuntos ficticios.
- Guion: «Si preguntan» de los adjuntos en el paso 1 y versión de 20 minutos.
- Recorrido: los clics del paso 3 sobre los adjuntos usan un selector válido
  ([data-adj="0"]); regenerados data/recorrido.js y los Word de los guiones.

Co-Authored-By: Claude Opus 5.5 <noreply@anthropic.com>
</commit_message>
<xml_diff>
--- a/_docs/guion-demo.docx
+++ b/_docs/guion-demo.docx
@@ -4116,7 +4116,7 @@
         <w:t xml:space="preserve">Si preguntan:</w:t>
       </w:r>
       <w:r>
-        <w:t xml:space="preserve"> ¿y los adjuntos o los audios? La llamada se transcribe con un modelo de voz a texto; los adjuntos se registran como documentación mencionada. El guardrail G-09 puede escalar a una persona las transcripciones con confianza baja.</w:t>
+        <w:t xml:space="preserve"> ¿y los adjuntos o los audios? La llamada se transcribe con un modelo de voz a texto. Los adjuntos se registran con su huella y sus datos se contrastan con el texto: lo veremos en la ficha de MSG-A-01, que trae el parte amistoso y dos fotos. El guardrail G-09 puede escalar a una persona las transcripciones con confianza baja.</w:t>
       </w:r>
     </w:p>
     <w:p>
@@ -17945,8 +17945,8 @@
         </w:tblBorders>
       </w:tblPr>
       <w:tblGrid>
-        <w:gridCol w:w="7240"/>
-        <w:gridCol w:w="2398"/>
+        <w:gridCol w:w="7397"/>
+        <w:gridCol w:w="2241"/>
       </w:tblGrid>
       <w:tr>
         <w:trPr>
@@ -17954,7 +17954,7 @@
         </w:trPr>
         <w:tc>
           <w:tcPr>
-            <w:tcW w:type="dxa" w:w="7240"/>
+            <w:tcW w:type="dxa" w:w="7397"/>
             <w:tcBorders>
               <w:top w:val="single" w:color="C9CED8" w:sz="4"/>
               <w:left w:val="single" w:color="C9CED8" w:sz="4"/>
@@ -17984,7 +17984,7 @@
         </w:tc>
         <w:tc>
           <w:tcPr>
-            <w:tcW w:type="dxa" w:w="2398"/>
+            <w:tcW w:type="dxa" w:w="2241"/>
             <w:tcBorders>
               <w:top w:val="single" w:color="C9CED8" w:sz="4"/>
               <w:left w:val="single" w:color="C9CED8" w:sz="4"/>
@@ -18016,7 +18016,7 @@
       <w:tr>
         <w:tc>
           <w:tcPr>
-            <w:tcW w:type="dxa" w:w="7240"/>
+            <w:tcW w:type="dxa" w:w="7397"/>
             <w:tcBorders>
               <w:top w:val="single" w:color="C9CED8" w:sz="4"/>
               <w:left w:val="single" w:color="C9CED8" w:sz="4"/>
@@ -18042,7 +18042,7 @@
         </w:tc>
         <w:tc>
           <w:tcPr>
-            <w:tcW w:type="dxa" w:w="2398"/>
+            <w:tcW w:type="dxa" w:w="2241"/>
             <w:tcBorders>
               <w:top w:val="single" w:color="C9CED8" w:sz="4"/>
               <w:left w:val="single" w:color="C9CED8" w:sz="4"/>
@@ -18070,53 +18070,53 @@
       <w:tr>
         <w:tc>
           <w:tcPr>
-            <w:tcW w:type="dxa" w:w="7240"/>
-            <w:tcBorders>
-              <w:top w:val="single" w:color="C9CED8" w:sz="4"/>
-              <w:left w:val="single" w:color="C9CED8" w:sz="4"/>
-              <w:bottom w:val="single" w:color="C9CED8" w:sz="4"/>
-              <w:right w:val="single" w:color="C9CED8" w:sz="4"/>
-            </w:tcBorders>
-            <w:tcMar>
-              <w:top w:type="dxa" w:w="60"/>
-              <w:left w:type="dxa" w:w="100"/>
-              <w:bottom w:type="dxa" w:w="60"/>
-              <w:right w:type="dxa" w:w="100"/>
-            </w:tcMar>
-          </w:tcPr>
-          <w:p>
-            <w:r>
-              <w:rPr>
-                <w:sz w:val="19"/>
-                <w:szCs w:val="19"/>
-              </w:rPr>
-              <w:t xml:space="preserve">Paso 3 (ficha de MSG-A-01): enseñar solo las evidencias desde el paso 4</w:t>
-            </w:r>
-          </w:p>
-        </w:tc>
-        <w:tc>
-          <w:tcPr>
-            <w:tcW w:type="dxa" w:w="2398"/>
-            <w:tcBorders>
-              <w:top w:val="single" w:color="C9CED8" w:sz="4"/>
-              <w:left w:val="single" w:color="C9CED8" w:sz="4"/>
-              <w:bottom w:val="single" w:color="C9CED8" w:sz="4"/>
-              <w:right w:val="single" w:color="C9CED8" w:sz="4"/>
-            </w:tcBorders>
-            <w:tcMar>
-              <w:top w:type="dxa" w:w="60"/>
-              <w:left w:type="dxa" w:w="100"/>
-              <w:bottom w:type="dxa" w:w="60"/>
-              <w:right w:type="dxa" w:w="100"/>
-            </w:tcMar>
-          </w:tcPr>
-          <w:p>
-            <w:r>
-              <w:rPr>
-                <w:sz w:val="19"/>
-                <w:szCs w:val="19"/>
-              </w:rPr>
-              <w:t xml:space="preserve">1,5 min</w:t>
+            <w:tcW w:type="dxa" w:w="7397"/>
+            <w:tcBorders>
+              <w:top w:val="single" w:color="C9CED8" w:sz="4"/>
+              <w:left w:val="single" w:color="C9CED8" w:sz="4"/>
+              <w:bottom w:val="single" w:color="C9CED8" w:sz="4"/>
+              <w:right w:val="single" w:color="C9CED8" w:sz="4"/>
+            </w:tcBorders>
+            <w:tcMar>
+              <w:top w:type="dxa" w:w="60"/>
+              <w:left w:type="dxa" w:w="100"/>
+              <w:bottom w:type="dxa" w:w="60"/>
+              <w:right w:type="dxa" w:w="100"/>
+            </w:tcMar>
+          </w:tcPr>
+          <w:p>
+            <w:r>
+              <w:rPr>
+                <w:sz w:val="19"/>
+                <w:szCs w:val="19"/>
+              </w:rPr>
+              <w:t xml:space="preserve">Paso 3 (ficha de MSG-A-01): enseñar solo la pestaña Adjuntos y dejar las evidencias para el paso 4</w:t>
+            </w:r>
+          </w:p>
+        </w:tc>
+        <w:tc>
+          <w:tcPr>
+            <w:tcW w:type="dxa" w:w="2241"/>
+            <w:tcBorders>
+              <w:top w:val="single" w:color="C9CED8" w:sz="4"/>
+              <w:left w:val="single" w:color="C9CED8" w:sz="4"/>
+              <w:bottom w:val="single" w:color="C9CED8" w:sz="4"/>
+              <w:right w:val="single" w:color="C9CED8" w:sz="4"/>
+            </w:tcBorders>
+            <w:tcMar>
+              <w:top w:type="dxa" w:w="60"/>
+              <w:left w:type="dxa" w:w="100"/>
+              <w:bottom w:type="dxa" w:w="60"/>
+              <w:right w:type="dxa" w:w="100"/>
+            </w:tcMar>
+          </w:tcPr>
+          <w:p>
+            <w:r>
+              <w:rPr>
+                <w:sz w:val="19"/>
+                <w:szCs w:val="19"/>
+              </w:rPr>
+              <w:t xml:space="preserve">1 min</w:t>
             </w:r>
           </w:p>
         </w:tc>
@@ -18124,7 +18124,7 @@
       <w:tr>
         <w:tc>
           <w:tcPr>
-            <w:tcW w:type="dxa" w:w="7240"/>
+            <w:tcW w:type="dxa" w:w="7397"/>
             <w:tcBorders>
               <w:top w:val="single" w:color="C9CED8" w:sz="4"/>
               <w:left w:val="single" w:color="C9CED8" w:sz="4"/>
@@ -18150,7 +18150,7 @@
         </w:tc>
         <w:tc>
           <w:tcPr>
-            <w:tcW w:type="dxa" w:w="2398"/>
+            <w:tcW w:type="dxa" w:w="2241"/>
             <w:tcBorders>
               <w:top w:val="single" w:color="C9CED8" w:sz="4"/>
               <w:left w:val="single" w:color="C9CED8" w:sz="4"/>
@@ -18178,7 +18178,7 @@
       <w:tr>
         <w:tc>
           <w:tcPr>
-            <w:tcW w:type="dxa" w:w="7240"/>
+            <w:tcW w:type="dxa" w:w="7397"/>
             <w:tcBorders>
               <w:top w:val="single" w:color="C9CED8" w:sz="4"/>
               <w:left w:val="single" w:color="C9CED8" w:sz="4"/>
@@ -18204,7 +18204,7 @@
         </w:tc>
         <w:tc>
           <w:tcPr>
-            <w:tcW w:type="dxa" w:w="2398"/>
+            <w:tcW w:type="dxa" w:w="2241"/>
             <w:tcBorders>
               <w:top w:val="single" w:color="C9CED8" w:sz="4"/>
               <w:left w:val="single" w:color="C9CED8" w:sz="4"/>
@@ -18232,7 +18232,7 @@
       <w:tr>
         <w:tc>
           <w:tcPr>
-            <w:tcW w:type="dxa" w:w="7240"/>
+            <w:tcW w:type="dxa" w:w="7397"/>
             <w:tcBorders>
               <w:top w:val="single" w:color="C9CED8" w:sz="4"/>
               <w:left w:val="single" w:color="C9CED8" w:sz="4"/>
@@ -18258,7 +18258,7 @@
         </w:tc>
         <w:tc>
           <w:tcPr>
-            <w:tcW w:type="dxa" w:w="2398"/>
+            <w:tcW w:type="dxa" w:w="2241"/>
             <w:tcBorders>
               <w:top w:val="single" w:color="C9CED8" w:sz="4"/>
               <w:left w:val="single" w:color="C9CED8" w:sz="4"/>
@@ -18286,7 +18286,7 @@
       <w:tr>
         <w:tc>
           <w:tcPr>
-            <w:tcW w:type="dxa" w:w="7240"/>
+            <w:tcW w:type="dxa" w:w="7397"/>
             <w:tcBorders>
               <w:top w:val="single" w:color="C9CED8" w:sz="4"/>
               <w:left w:val="single" w:color="C9CED8" w:sz="4"/>
@@ -18312,7 +18312,7 @@
         </w:tc>
         <w:tc>
           <w:tcPr>
-            <w:tcW w:type="dxa" w:w="2398"/>
+            <w:tcW w:type="dxa" w:w="2241"/>
             <w:tcBorders>
               <w:top w:val="single" w:color="C9CED8" w:sz="4"/>
               <w:left w:val="single" w:color="C9CED8" w:sz="4"/>
@@ -18340,7 +18340,7 @@
       <w:tr>
         <w:tc>
           <w:tcPr>
-            <w:tcW w:type="dxa" w:w="7240"/>
+            <w:tcW w:type="dxa" w:w="7397"/>
             <w:tcBorders>
               <w:top w:val="single" w:color="C9CED8" w:sz="4"/>
               <w:left w:val="single" w:color="C9CED8" w:sz="4"/>
@@ -18366,7 +18366,7 @@
         </w:tc>
         <w:tc>
           <w:tcPr>
-            <w:tcW w:type="dxa" w:w="2398"/>
+            <w:tcW w:type="dxa" w:w="2241"/>
             <w:tcBorders>
               <w:top w:val="single" w:color="C9CED8" w:sz="4"/>
               <w:left w:val="single" w:color="C9CED8" w:sz="4"/>

</xml_diff>